<commit_message>
add component architecture and teaching design
</commit_message>
<xml_diff>
--- a/docs/architecture/Cramapple-High-Level-System-Architecture-v0.1.docx
+++ b/docs/architecture/Cramapple-High-Level-System-Architecture-v0.1.docx
@@ -204,7 +204,27 @@
         <w:widowControl/>
       </w:pPr>
       <w:r>
-        <w:t>Detailed teaching and grading system designs will be maintained separately. This document defines the platform contract within which those systems operate.</w:t>
+        <w:t xml:space="preserve">Detailed designs are maintained separately. The system context and component model is defined in </w:t>
+      </w:r>
+      <w:r>
+        <w:rPr>
+          <w:rFonts w:ascii="Consolas" w:hAnsi="Consolas"/>
+          <w:sz w:val="19"/>
+        </w:rPr>
+        <w:t>SYSTEM_CONTEXT_AND_LOGICAL_COMPONENT_ARCHITECTURE.md</w:t>
+      </w:r>
+      <w:r>
+        <w:t xml:space="preserve">. Teaching behavior is defined in </w:t>
+      </w:r>
+      <w:r>
+        <w:rPr>
+          <w:rFonts w:ascii="Consolas" w:hAnsi="Consolas"/>
+          <w:sz w:val="19"/>
+        </w:rPr>
+        <w:t>../teaching/TEACHING_AND_PEDAGOGY_DESIGN.md</w:t>
+      </w:r>
+      <w:r>
+        <w:t>. A grading design remains a required follow-on artifact.</w:t>
       </w:r>
     </w:p>
     <w:p>
@@ -771,6 +791,7 @@
       <w:tr>
         <w:trPr>
           <w:tblHeader w:val="true"/>
+          <w:cantSplit/>
         </w:trPr>
         <w:tc>
           <w:tcPr>
@@ -828,6 +849,9 @@
         </w:tc>
       </w:tr>
       <w:tr>
+        <w:trPr>
+          <w:cantSplit/>
+        </w:trPr>
         <w:tc>
           <w:tcPr>
             <w:tcW w:type="dxa" w:w="3000"/>
@@ -882,6 +906,9 @@
         </w:tc>
       </w:tr>
       <w:tr>
+        <w:trPr>
+          <w:cantSplit/>
+        </w:trPr>
         <w:tc>
           <w:tcPr>
             <w:tcW w:type="dxa" w:w="3000"/>
@@ -936,6 +963,9 @@
         </w:tc>
       </w:tr>
       <w:tr>
+        <w:trPr>
+          <w:cantSplit/>
+        </w:trPr>
         <w:tc>
           <w:tcPr>
             <w:tcW w:type="dxa" w:w="3000"/>
@@ -990,6 +1020,9 @@
         </w:tc>
       </w:tr>
       <w:tr>
+        <w:trPr>
+          <w:cantSplit/>
+        </w:trPr>
         <w:tc>
           <w:tcPr>
             <w:tcW w:type="dxa" w:w="3000"/>
@@ -1044,6 +1077,9 @@
         </w:tc>
       </w:tr>
       <w:tr>
+        <w:trPr>
+          <w:cantSplit/>
+        </w:trPr>
         <w:tc>
           <w:tcPr>
             <w:tcW w:type="dxa" w:w="3000"/>
@@ -1098,6 +1134,9 @@
         </w:tc>
       </w:tr>
       <w:tr>
+        <w:trPr>
+          <w:cantSplit/>
+        </w:trPr>
         <w:tc>
           <w:tcPr>
             <w:tcW w:type="dxa" w:w="3000"/>
@@ -1152,6 +1191,9 @@
         </w:tc>
       </w:tr>
       <w:tr>
+        <w:trPr>
+          <w:cantSplit/>
+        </w:trPr>
         <w:tc>
           <w:tcPr>
             <w:tcW w:type="dxa" w:w="3000"/>
@@ -1206,6 +1248,9 @@
         </w:tc>
       </w:tr>
       <w:tr>
+        <w:trPr>
+          <w:cantSplit/>
+        </w:trPr>
         <w:tc>
           <w:tcPr>
             <w:tcW w:type="dxa" w:w="3000"/>
@@ -1260,6 +1305,9 @@
         </w:tc>
       </w:tr>
       <w:tr>
+        <w:trPr>
+          <w:cantSplit/>
+        </w:trPr>
         <w:tc>
           <w:tcPr>
             <w:tcW w:type="dxa" w:w="3000"/>
@@ -1343,6 +1391,7 @@
       <w:tr>
         <w:trPr>
           <w:tblHeader w:val="true"/>
+          <w:cantSplit/>
         </w:trPr>
         <w:tc>
           <w:tcPr>
@@ -1400,6 +1449,9 @@
         </w:tc>
       </w:tr>
       <w:tr>
+        <w:trPr>
+          <w:cantSplit/>
+        </w:trPr>
         <w:tc>
           <w:tcPr>
             <w:tcW w:type="dxa" w:w="3000"/>
@@ -1454,6 +1506,9 @@
         </w:tc>
       </w:tr>
       <w:tr>
+        <w:trPr>
+          <w:cantSplit/>
+        </w:trPr>
         <w:tc>
           <w:tcPr>
             <w:tcW w:type="dxa" w:w="3000"/>
@@ -1508,6 +1563,9 @@
         </w:tc>
       </w:tr>
       <w:tr>
+        <w:trPr>
+          <w:cantSplit/>
+        </w:trPr>
         <w:tc>
           <w:tcPr>
             <w:tcW w:type="dxa" w:w="3000"/>
@@ -1562,6 +1620,9 @@
         </w:tc>
       </w:tr>
       <w:tr>
+        <w:trPr>
+          <w:cantSplit/>
+        </w:trPr>
         <w:tc>
           <w:tcPr>
             <w:tcW w:type="dxa" w:w="3000"/>
@@ -1616,6 +1677,9 @@
         </w:tc>
       </w:tr>
       <w:tr>
+        <w:trPr>
+          <w:cantSplit/>
+        </w:trPr>
         <w:tc>
           <w:tcPr>
             <w:tcW w:type="dxa" w:w="3000"/>
@@ -1670,6 +1734,9 @@
         </w:tc>
       </w:tr>
       <w:tr>
+        <w:trPr>
+          <w:cantSplit/>
+        </w:trPr>
         <w:tc>
           <w:tcPr>
             <w:tcW w:type="dxa" w:w="3000"/>
@@ -1724,6 +1791,9 @@
         </w:tc>
       </w:tr>
       <w:tr>
+        <w:trPr>
+          <w:cantSplit/>
+        </w:trPr>
         <w:tc>
           <w:tcPr>
             <w:tcW w:type="dxa" w:w="3000"/>
@@ -1778,6 +1848,9 @@
         </w:tc>
       </w:tr>
       <w:tr>
+        <w:trPr>
+          <w:cantSplit/>
+        </w:trPr>
         <w:tc>
           <w:tcPr>
             <w:tcW w:type="dxa" w:w="3000"/>
@@ -1832,6 +1905,9 @@
         </w:tc>
       </w:tr>
       <w:tr>
+        <w:trPr>
+          <w:cantSplit/>
+        </w:trPr>
         <w:tc>
           <w:tcPr>
             <w:tcW w:type="dxa" w:w="3000"/>
@@ -2023,6 +2099,7 @@
       <w:tr>
         <w:trPr>
           <w:tblHeader w:val="true"/>
+          <w:cantSplit/>
         </w:trPr>
         <w:tc>
           <w:tcPr>
@@ -2107,6 +2184,9 @@
         </w:tc>
       </w:tr>
       <w:tr>
+        <w:trPr>
+          <w:cantSplit/>
+        </w:trPr>
         <w:tc>
           <w:tcPr>
             <w:tcW w:type="dxa" w:w="2600"/>
@@ -2187,6 +2267,9 @@
         </w:tc>
       </w:tr>
       <w:tr>
+        <w:trPr>
+          <w:cantSplit/>
+        </w:trPr>
         <w:tc>
           <w:tcPr>
             <w:tcW w:type="dxa" w:w="2600"/>
@@ -2267,6 +2350,9 @@
         </w:tc>
       </w:tr>
       <w:tr>
+        <w:trPr>
+          <w:cantSplit/>
+        </w:trPr>
         <w:tc>
           <w:tcPr>
             <w:tcW w:type="dxa" w:w="2600"/>
@@ -2347,6 +2433,9 @@
         </w:tc>
       </w:tr>
       <w:tr>
+        <w:trPr>
+          <w:cantSplit/>
+        </w:trPr>
         <w:tc>
           <w:tcPr>
             <w:tcW w:type="dxa" w:w="2600"/>
@@ -2427,6 +2516,9 @@
         </w:tc>
       </w:tr>
       <w:tr>
+        <w:trPr>
+          <w:cantSplit/>
+        </w:trPr>
         <w:tc>
           <w:tcPr>
             <w:tcW w:type="dxa" w:w="2600"/>
@@ -2507,6 +2599,9 @@
         </w:tc>
       </w:tr>
       <w:tr>
+        <w:trPr>
+          <w:cantSplit/>
+        </w:trPr>
         <w:tc>
           <w:tcPr>
             <w:tcW w:type="dxa" w:w="2600"/>
@@ -2587,6 +2682,9 @@
         </w:tc>
       </w:tr>
       <w:tr>
+        <w:trPr>
+          <w:cantSplit/>
+        </w:trPr>
         <w:tc>
           <w:tcPr>
             <w:tcW w:type="dxa" w:w="2600"/>
@@ -2667,6 +2765,9 @@
         </w:tc>
       </w:tr>
       <w:tr>
+        <w:trPr>
+          <w:cantSplit/>
+        </w:trPr>
         <w:tc>
           <w:tcPr>
             <w:tcW w:type="dxa" w:w="2600"/>
@@ -2747,6 +2848,9 @@
         </w:tc>
       </w:tr>
       <w:tr>
+        <w:trPr>
+          <w:cantSplit/>
+        </w:trPr>
         <w:tc>
           <w:tcPr>
             <w:tcW w:type="dxa" w:w="2600"/>
@@ -2827,6 +2931,9 @@
         </w:tc>
       </w:tr>
       <w:tr>
+        <w:trPr>
+          <w:cantSplit/>
+        </w:trPr>
         <w:tc>
           <w:tcPr>
             <w:tcW w:type="dxa" w:w="2600"/>
@@ -2907,6 +3014,9 @@
         </w:tc>
       </w:tr>
       <w:tr>
+        <w:trPr>
+          <w:cantSplit/>
+        </w:trPr>
         <w:tc>
           <w:tcPr>
             <w:tcW w:type="dxa" w:w="2600"/>
@@ -2987,6 +3097,9 @@
         </w:tc>
       </w:tr>
       <w:tr>
+        <w:trPr>
+          <w:cantSplit/>
+        </w:trPr>
         <w:tc>
           <w:tcPr>
             <w:tcW w:type="dxa" w:w="2600"/>
@@ -3821,9 +3934,6 @@
         <w:gridCol w:w="9360"/>
       </w:tblGrid>
       <w:tr>
-        <w:trPr>
-          <w:cantSplit/>
-        </w:trPr>
         <w:tc>
           <w:tcPr>
             <w:tcW w:type="dxa" w:w="9360"/>
@@ -4622,6 +4732,7 @@
       <w:tr>
         <w:trPr>
           <w:tblHeader w:val="true"/>
+          <w:cantSplit/>
         </w:trPr>
         <w:tc>
           <w:tcPr>
@@ -4733,6 +4844,9 @@
         </w:tc>
       </w:tr>
       <w:tr>
+        <w:trPr>
+          <w:cantSplit/>
+        </w:trPr>
         <w:tc>
           <w:tcPr>
             <w:tcW w:type="dxa" w:w="1900"/>
@@ -4839,6 +4953,9 @@
         </w:tc>
       </w:tr>
       <w:tr>
+        <w:trPr>
+          <w:cantSplit/>
+        </w:trPr>
         <w:tc>
           <w:tcPr>
             <w:tcW w:type="dxa" w:w="1900"/>
@@ -4945,6 +5062,9 @@
         </w:tc>
       </w:tr>
       <w:tr>
+        <w:trPr>
+          <w:cantSplit/>
+        </w:trPr>
         <w:tc>
           <w:tcPr>
             <w:tcW w:type="dxa" w:w="1900"/>
@@ -5051,6 +5171,9 @@
         </w:tc>
       </w:tr>
       <w:tr>
+        <w:trPr>
+          <w:cantSplit/>
+        </w:trPr>
         <w:tc>
           <w:tcPr>
             <w:tcW w:type="dxa" w:w="1900"/>
@@ -5157,6 +5280,9 @@
         </w:tc>
       </w:tr>
       <w:tr>
+        <w:trPr>
+          <w:cantSplit/>
+        </w:trPr>
         <w:tc>
           <w:tcPr>
             <w:tcW w:type="dxa" w:w="1900"/>
@@ -6528,6 +6654,7 @@
       <w:tr>
         <w:trPr>
           <w:tblHeader w:val="true"/>
+          <w:cantSplit/>
         </w:trPr>
         <w:tc>
           <w:tcPr>
@@ -6585,6 +6712,9 @@
         </w:tc>
       </w:tr>
       <w:tr>
+        <w:trPr>
+          <w:cantSplit/>
+        </w:trPr>
         <w:tc>
           <w:tcPr>
             <w:tcW w:type="dxa" w:w="3000"/>
@@ -6639,6 +6769,9 @@
         </w:tc>
       </w:tr>
       <w:tr>
+        <w:trPr>
+          <w:cantSplit/>
+        </w:trPr>
         <w:tc>
           <w:tcPr>
             <w:tcW w:type="dxa" w:w="3000"/>
@@ -6693,6 +6826,9 @@
         </w:tc>
       </w:tr>
       <w:tr>
+        <w:trPr>
+          <w:cantSplit/>
+        </w:trPr>
         <w:tc>
           <w:tcPr>
             <w:tcW w:type="dxa" w:w="3000"/>
@@ -6747,6 +6883,9 @@
         </w:tc>
       </w:tr>
       <w:tr>
+        <w:trPr>
+          <w:cantSplit/>
+        </w:trPr>
         <w:tc>
           <w:tcPr>
             <w:tcW w:type="dxa" w:w="3000"/>
@@ -7695,6 +7834,7 @@
       <w:tr>
         <w:trPr>
           <w:tblHeader w:val="true"/>
+          <w:cantSplit/>
         </w:trPr>
         <w:tc>
           <w:tcPr>
@@ -7752,6 +7892,9 @@
         </w:tc>
       </w:tr>
       <w:tr>
+        <w:trPr>
+          <w:cantSplit/>
+        </w:trPr>
         <w:tc>
           <w:tcPr>
             <w:tcW w:type="dxa" w:w="3000"/>
@@ -7806,6 +7949,9 @@
         </w:tc>
       </w:tr>
       <w:tr>
+        <w:trPr>
+          <w:cantSplit/>
+        </w:trPr>
         <w:tc>
           <w:tcPr>
             <w:tcW w:type="dxa" w:w="3000"/>
@@ -7860,6 +8006,9 @@
         </w:tc>
       </w:tr>
       <w:tr>
+        <w:trPr>
+          <w:cantSplit/>
+        </w:trPr>
         <w:tc>
           <w:tcPr>
             <w:tcW w:type="dxa" w:w="3000"/>
@@ -7914,6 +8063,9 @@
         </w:tc>
       </w:tr>
       <w:tr>
+        <w:trPr>
+          <w:cantSplit/>
+        </w:trPr>
         <w:tc>
           <w:tcPr>
             <w:tcW w:type="dxa" w:w="3000"/>
@@ -7968,6 +8120,9 @@
         </w:tc>
       </w:tr>
       <w:tr>
+        <w:trPr>
+          <w:cantSplit/>
+        </w:trPr>
         <w:tc>
           <w:tcPr>
             <w:tcW w:type="dxa" w:w="3000"/>
@@ -8022,6 +8177,9 @@
         </w:tc>
       </w:tr>
       <w:tr>
+        <w:trPr>
+          <w:cantSplit/>
+        </w:trPr>
         <w:tc>
           <w:tcPr>
             <w:tcW w:type="dxa" w:w="3000"/>
@@ -8076,6 +8234,9 @@
         </w:tc>
       </w:tr>
       <w:tr>
+        <w:trPr>
+          <w:cantSplit/>
+        </w:trPr>
         <w:tc>
           <w:tcPr>
             <w:tcW w:type="dxa" w:w="3000"/>
@@ -8130,6 +8291,9 @@
         </w:tc>
       </w:tr>
       <w:tr>
+        <w:trPr>
+          <w:cantSplit/>
+        </w:trPr>
         <w:tc>
           <w:tcPr>
             <w:tcW w:type="dxa" w:w="3000"/>
@@ -8832,7 +8996,17 @@
         <w:t>Teaching System Design:</w:t>
       </w:r>
       <w:r>
-        <w:t xml:space="preserve"> learning taxonomy, instructional patterns, diagnostics, remediation, recommendation logic, spaced review, and pedagogical validation.</w:t>
+        <w:t xml:space="preserve"> defined initially in </w:t>
+      </w:r>
+      <w:r>
+        <w:rPr>
+          <w:rFonts w:ascii="Consolas" w:hAnsi="Consolas"/>
+          <w:sz w:val="19"/>
+        </w:rPr>
+        <w:t>../teaching/TEACHING_AND_PEDAGOGY_DESIGN.md</w:t>
+      </w:r>
+      <w:r>
+        <w:t>; refine after owner and tutor review.</w:t>
       </w:r>
     </w:p>
     <w:p>

</xml_diff>

<commit_message>
docs: unify learning and stuck-state model
</commit_message>
<xml_diff>
--- a/docs/architecture/Cramapple-High-Level-System-Architecture-v0.1.docx
+++ b/docs/architecture/Cramapple-High-Level-System-Architecture-v0.1.docx
@@ -75,7 +75,7 @@
           <w:color w:val="202D3A"/>
           <w:sz w:val="21"/>
         </w:rPr>
-        <w:t>June 9, 2026</w:t>
+        <w:t>June 10, 2026</w:t>
       </w:r>
     </w:p>
     <w:p>
@@ -4433,17 +4433,6 @@
     </w:p>
     <w:p>
       <w:pPr>
-        <w:widowControl/>
-      </w:pPr>
-      <w:r>
-        <w:rPr>
-          <w:b/>
-        </w:rPr>
-        <w:t>Progress and learner-state service</w:t>
-      </w:r>
-    </w:p>
-    <w:p>
-      <w:pPr>
         <w:numPr>
           <w:ilvl w:val="0"/>
           <w:numId w:val="10"/>
@@ -4451,7 +4440,7 @@
         <w:spacing w:after="160" w:line="280" w:lineRule="auto"/>
       </w:pPr>
       <w:r>
-        <w:t>Rebuilds strength, difficulty, recurrence, confidence, and recency views.</w:t>
+        <w:t>Separates private learner use, anonymous internal improvement use, and separately gated public publication.</w:t>
       </w:r>
     </w:p>
     <w:p>
@@ -4463,7 +4452,7 @@
         <w:spacing w:after="160" w:line="280" w:lineRule="auto"/>
       </w:pPr>
       <w:r>
-        <w:t>Selects comparable evidence and creates qualified progress statements.</w:t>
+        <w:t>Sweeps public candidates for the signed-in user's proper name variants and holds or removes matches.</w:t>
       </w:r>
     </w:p>
     <w:p>
@@ -4474,7 +4463,7 @@
         <w:rPr>
           <w:b/>
         </w:rPr>
-        <w:t>Content validation and publication service</w:t>
+        <w:t>Progress and learner-state service</w:t>
       </w:r>
     </w:p>
     <w:p>
@@ -4486,18 +4475,7 @@
         <w:spacing w:after="160" w:line="280" w:lineRule="auto"/>
       </w:pPr>
       <w:r>
-        <w:t>Manages artifact versions, review requirements, assignments, decisions, disagreements, and publication gates.</w:t>
-      </w:r>
-    </w:p>
-    <w:p>
-      <w:pPr>
-        <w:widowControl/>
-      </w:pPr>
-      <w:r>
-        <w:rPr>
-          <w:b/>
-        </w:rPr>
-        <w:t>Identity and entitlement service</w:t>
+        <w:t>Rebuilds strength, difficulty, recurrence, confidence, and recency views.</w:t>
       </w:r>
     </w:p>
     <w:p>
@@ -4509,7 +4487,7 @@
         <w:spacing w:after="160" w:line="280" w:lineRule="auto"/>
       </w:pPr>
       <w:r>
-        <w:t>Evaluates actor, role, scope, subject, artifact, environment, product access, relationship, and consent.</w:t>
+        <w:t>Selects comparable evidence and creates qualified progress statements.</w:t>
       </w:r>
     </w:p>
     <w:p>
@@ -4521,7 +4499,7 @@
         <w:spacing w:after="160" w:line="280" w:lineRule="auto"/>
       </w:pPr>
       <w:r>
-        <w:t>Separates payment eligibility from data authorization.</w:t>
+        <w:t>Persists support level, escalation route, immediate transfer, delayed retention, Move On, and Park state by skill and task type.</w:t>
       </w:r>
     </w:p>
     <w:p>
@@ -4532,7 +4510,7 @@
         <w:rPr>
           <w:b/>
         </w:rPr>
-        <w:t>Event and integration service</w:t>
+        <w:t>Content validation and publication service</w:t>
       </w:r>
     </w:p>
     <w:p>
@@ -4544,7 +4522,18 @@
         <w:spacing w:after="160" w:line="280" w:lineRule="auto"/>
       </w:pPr>
       <w:r>
-        <w:t>Produces a controlled internal event stream.</w:t>
+        <w:t>Manages artifact versions, review requirements, assignments, decisions, disagreements, and publication gates.</w:t>
+      </w:r>
+    </w:p>
+    <w:p>
+      <w:pPr>
+        <w:widowControl/>
+      </w:pPr>
+      <w:r>
+        <w:rPr>
+          <w:b/>
+        </w:rPr>
+        <w:t>Identity and entitlement service</w:t>
       </w:r>
     </w:p>
     <w:p>
@@ -4556,7 +4545,7 @@
         <w:spacing w:after="160" w:line="280" w:lineRule="auto"/>
       </w:pPr>
       <w:r>
-        <w:t>Maps approved events to analytics, lifecycle, payment, and social integrations.</w:t>
+        <w:t>Evaluates actor, role, scope, subject, artifact, environment, product access, relationship, and consent.</w:t>
       </w:r>
     </w:p>
     <w:p>
@@ -4568,15 +4557,7 @@
         <w:spacing w:after="160" w:line="280" w:lineRule="auto"/>
       </w:pPr>
       <w:r>
-        <w:t>Removes or blocks sensitive learning payloads.</w:t>
-      </w:r>
-    </w:p>
-    <w:p>
-      <w:pPr>
-        <w:pStyle w:val="Heading2"/>
-      </w:pPr>
-      <w:r>
-        <w:t>9.3 Data and Content Layer</w:t>
+        <w:t>Separates payment eligibility from data authorization.</w:t>
       </w:r>
     </w:p>
     <w:p>
@@ -4587,7 +4568,7 @@
         <w:rPr>
           <w:b/>
         </w:rPr>
-        <w:t>Canonical content and exam packs</w:t>
+        <w:t>Event and integration service</w:t>
       </w:r>
     </w:p>
     <w:p>
@@ -4599,18 +4580,7 @@
         <w:spacing w:after="160" w:line="280" w:lineRule="auto"/>
       </w:pPr>
       <w:r>
-        <w:t>Exam taxonomy, approved sources, teaching artifacts, questions, rubrics, accepted variants, misconceptions, samples, and approval records.</w:t>
-      </w:r>
-    </w:p>
-    <w:p>
-      <w:pPr>
-        <w:widowControl/>
-      </w:pPr>
-      <w:r>
-        <w:rPr>
-          <w:b/>
-        </w:rPr>
-        <w:t>Learner evidence</w:t>
+        <w:t>Produces a controlled internal event stream.</w:t>
       </w:r>
     </w:p>
     <w:p>
@@ -4622,7 +4592,120 @@
         <w:spacing w:after="160" w:line="280" w:lineRule="auto"/>
       </w:pPr>
       <w:r>
+        <w:t>Maps approved events to analytics, lifecycle, payment, and social integrations.</w:t>
+      </w:r>
+    </w:p>
+    <w:p>
+      <w:pPr>
+        <w:numPr>
+          <w:ilvl w:val="0"/>
+          <w:numId w:val="10"/>
+        </w:numPr>
+        <w:spacing w:after="160" w:line="280" w:lineRule="auto"/>
+      </w:pPr>
+      <w:r>
+        <w:t>Removes or blocks sensitive learning payloads.</w:t>
+      </w:r>
+    </w:p>
+    <w:p>
+      <w:pPr>
+        <w:pStyle w:val="Heading2"/>
+      </w:pPr>
+      <w:r>
+        <w:t>9.3 Data and Content Layer</w:t>
+      </w:r>
+    </w:p>
+    <w:p>
+      <w:pPr>
+        <w:widowControl/>
+      </w:pPr>
+      <w:r>
+        <w:rPr>
+          <w:b/>
+        </w:rPr>
+        <w:t>Canonical content and exam packs</w:t>
+      </w:r>
+    </w:p>
+    <w:p>
+      <w:pPr>
+        <w:numPr>
+          <w:ilvl w:val="0"/>
+          <w:numId w:val="10"/>
+        </w:numPr>
+        <w:spacing w:after="160" w:line="280" w:lineRule="auto"/>
+      </w:pPr>
+      <w:r>
+        <w:t>Exam taxonomy, approved sources, teaching artifacts, questions, rubrics, accepted variants, misconceptions, samples, and approval records.</w:t>
+      </w:r>
+    </w:p>
+    <w:p>
+      <w:pPr>
+        <w:widowControl/>
+      </w:pPr>
+      <w:r>
+        <w:rPr>
+          <w:b/>
+        </w:rPr>
+        <w:t>Learner evidence</w:t>
+      </w:r>
+    </w:p>
+    <w:p>
+      <w:pPr>
+        <w:numPr>
+          <w:ilvl w:val="0"/>
+          <w:numId w:val="10"/>
+        </w:numPr>
+        <w:spacing w:after="160" w:line="280" w:lineRule="auto"/>
+      </w:pPr>
+      <w:r>
         <w:t>Sessions, attempts, responses, assistance used, criterion results, confidence, timing, and evaluation provenance.</w:t>
+      </w:r>
+    </w:p>
+    <w:p>
+      <w:pPr>
+        <w:widowControl/>
+      </w:pPr>
+      <w:r>
+        <w:rPr>
+          <w:b/>
+        </w:rPr>
+        <w:t>Anonymous improvement evidence</w:t>
+      </w:r>
+    </w:p>
+    <w:p>
+      <w:pPr>
+        <w:numPr>
+          <w:ilvl w:val="0"/>
+          <w:numId w:val="10"/>
+        </w:numPr>
+        <w:spacing w:after="160" w:line="280" w:lineRule="auto"/>
+      </w:pPr>
+      <w:r>
+        <w:t>Deidentified responses, outcomes, validator corrections, and version provenance used to improve Cramapple's grading, teaching, content, evaluation sets, prompts, model configurations, and routing policies.</w:t>
+      </w:r>
+    </w:p>
+    <w:p>
+      <w:pPr>
+        <w:numPr>
+          <w:ilvl w:val="0"/>
+          <w:numId w:val="10"/>
+        </w:numPr>
+        <w:spacing w:after="160" w:line="280" w:lineRule="auto"/>
+      </w:pPr>
+      <w:r>
+        <w:t>Excludes identity, account, payment, parent, and direct-contact fields.</w:t>
+      </w:r>
+    </w:p>
+    <w:p>
+      <w:pPr>
+        <w:numPr>
+          <w:ilvl w:val="0"/>
+          <w:numId w:val="10"/>
+        </w:numPr>
+        <w:spacing w:after="160" w:line="280" w:lineRule="auto"/>
+      </w:pPr>
+      <w:r>
+        <w:t>Does not make a response public; publication requires a separate release decision.</w:t>
       </w:r>
     </w:p>
     <w:p>

</xml_diff>